<commit_message>
Correct semester grading totals to 25, 25 and 50 points
</commit_message>
<xml_diff>
--- a/public/reports/C3_S6_LR01.docx
+++ b/public/reports/C3_S6_LR01.docx
@@ -1842,7 +1842,7 @@
           <w:color w:val="000000"/>
           <w:sz w:val="24"/>
         </w:rPr>
-        <w:t>ЛР 1 · семестр 6 · максимум 10 баллов</w:t>
+        <w:t>ЛР 1 · семестр 6 · максимум 3 балла</w:t>
       </w:r>
     </w:p>
     <w:p>
@@ -2444,7 +2444,7 @@
                 <w:color w:val="000000"/>
                 <w:sz w:val="24"/>
               </w:rPr>
-              <w:t>4</w:t>
+              <w:t>1,2</w:t>
             </w:r>
           </w:p>
         </w:tc>
@@ -2488,7 +2488,7 @@
                 <w:color w:val="000000"/>
                 <w:sz w:val="24"/>
               </w:rPr>
-              <w:t>2</w:t>
+              <w:t>0,6</w:t>
             </w:r>
           </w:p>
         </w:tc>
@@ -2532,7 +2532,7 @@
                 <w:color w:val="000000"/>
                 <w:sz w:val="24"/>
               </w:rPr>
-              <w:t>2</w:t>
+              <w:t>0,6</w:t>
             </w:r>
           </w:p>
         </w:tc>
@@ -2576,7 +2576,7 @@
                 <w:color w:val="000000"/>
                 <w:sz w:val="24"/>
               </w:rPr>
-              <w:t>1</w:t>
+              <w:t>0,3</w:t>
             </w:r>
           </w:p>
         </w:tc>
@@ -2618,7 +2618,7 @@
                 <w:color w:val="000000"/>
                 <w:sz w:val="24"/>
               </w:rPr>
-              <w:t>1</w:t>
+              <w:t>0,3</w:t>
             </w:r>
           </w:p>
         </w:tc>

</xml_diff>